<commit_message>
Satin sheets 4-piece: price every exact campaign by the bids-and-placements method
- SS-S4: contribution per serving child (removal and disposal fees left out),
  a ceiling per placement, base at what product pages afford, top of search
  at or under its ceiling, modifier solved; posture code red (TACoS 2.13x
  its band): no premium, no price rises, cuts in loss-dollar order; four
  push conditions per ranking term (none met)
- SS-S4 action plan: T1-T4 tabs; new final plan with the review table
- Both products: aged-stock rows priced on clearance economics, rows with no
  rate or margin held, push rows left to the push gate, nearest whole-percent
  modifier

Co-Authored-By: Claude Opus 5.5 <noreply@anthropic.com>
Claude-Session: https://claude.ai/code/session_01LY7A1KPDoE1cQtWdmceR2R
</commit_message>
<xml_diff>
--- a/docs/DSFS_Final_Plan_20260930.docx
+++ b/docs/DSFS_Final_Plan_20260930.docx
@@ -1804,7 +1804,7 @@
                 <w:sz w:val="16"/>
                 <w:szCs w:val="16"/>
               </w:rPr>
-              <w:t xml:space="preserve">354 placement rows (T2) and a ceiling per placement per campaign (T3)</w:t>
+              <w:t xml:space="preserve">357 placement rows (T2) and a ceiling per placement per campaign (T3)</w:t>
             </w:r>
           </w:p>
         </w:tc>
@@ -1893,7 +1893,7 @@
                 <w:sz w:val="16"/>
                 <w:szCs w:val="16"/>
               </w:rPr>
-              <w:t xml:space="preserve">47 campaigns bring the base toward what product pages afford (≤25% a write with sales), 1 distribution fix</w:t>
+              <w:t xml:space="preserve">48 campaigns bring the base toward what product pages afford (≤25% a write with sales), 1 distribution fix</w:t>
             </w:r>
           </w:p>
         </w:tc>
@@ -1982,7 +1982,7 @@
                 <w:sz w:val="16"/>
                 <w:szCs w:val="16"/>
               </w:rPr>
-              <w:t xml:space="preserve">No flat step on exact rows; 45 descents to the ceiling, the rest held by solving the modifier</w:t>
+              <w:t xml:space="preserve">No flat step on exact rows; 46 descents to the ceiling, the rest held by solving the modifier</w:t>
             </w:r>
           </w:p>
         </w:tc>
@@ -2912,7 +2912,7 @@
                 <w:sz w:val="16"/>
                 <w:szCs w:val="16"/>
               </w:rPr>
-              <w:t xml:space="preserve">51 of 118 change: bases above what a product-page click affords come down (≤25% a write on rows with sales), top-of-search prices above their ceiling come down to it, none goes up; rest of search to zero where not earned. Each row states both prices (T3).</w:t>
+              <w:t xml:space="preserve">52 of 119 change: bases above what a product-page click affords come down (≤25% a write on rows with sales), top-of-search prices above their ceiling come down to it, none goes up; rest of search to zero where not earned. Each row states both prices (T3).</w:t>
             </w:r>
           </w:p>
         </w:tc>
@@ -4085,7 +4085,7 @@
                 <w:sz w:val="16"/>
                 <w:szCs w:val="16"/>
               </w:rPr>
-              <w:t xml:space="preserve">Upload step 3: 64 re-points off out-of-stock children, the exact re-solve on 51 campaigns (T3), back-up ads (paused), and the core fitted test (New campaign (bulk) tab)</w:t>
+              <w:t xml:space="preserve">Upload step 3: 64 re-points off out-of-stock children, the exact re-solve on 52 campaigns (T3), back-up ads (paused), and the core fitted test (New campaign (bulk) tab)</w:t>
             </w:r>
           </w:p>
         </w:tc>
@@ -5578,7 +5578,7 @@
                 <w:sz w:val="16"/>
                 <w:szCs w:val="16"/>
               </w:rPr>
-              <w:t xml:space="preserve">121</w:t>
+              <w:t xml:space="preserve">127</w:t>
             </w:r>
           </w:p>
         </w:tc>
@@ -6023,7 +6023,7 @@
                 <w:sz w:val="16"/>
                 <w:szCs w:val="16"/>
               </w:rPr>
-              <w:t xml:space="preserve">54</w:t>
+              <w:t xml:space="preserve">55</w:t>
             </w:r>
           </w:p>
         </w:tc>
@@ -6395,7 +6395,7 @@
         <w:spacing w:after="120"/>
       </w:pPr>
       <w:r>
-        <w:t xml:space="preserve">377 changes in all. 264 rows load from the Bulk upload tab, 7 from the New campaign (bulk) tab; 67 need an ID from the console (product-ad pauses, multi-ad-group campaigns) and are listed with the reason. Every exact price that comes down lands on a named point — its ceiling, or a dated step — and none goes up (breach). Deal-window rows (63 campaigns, 16 and 29 Oct) are on their own tab.</w:t>
+        <w:t xml:space="preserve">384 changes in all. 271 rows load from the Bulk upload tab, 7 from the New campaign (bulk) tab; 67 need an ID from the console (product-ad pauses, multi-ad-group campaigns) and are listed with the reason. Every exact price that comes down lands on a named point — its ceiling, or a dated step — and none goes up (breach). Deal-window rows (63 campaigns, 16 and 29 Oct) are on their own tab.</w:t>
       </w:r>
     </w:p>
     <w:p>
@@ -7260,7 +7260,7 @@
                 <w:sz w:val="16"/>
                 <w:szCs w:val="16"/>
               </w:rPr>
-              <w:t xml:space="preserve">$5.5 (30 days)</w:t>
+              <w:t xml:space="preserve">$5.50 (30 days)</w:t>
             </w:r>
           </w:p>
         </w:tc>
@@ -7695,7 +7695,7 @@
                 <w:sz w:val="16"/>
                 <w:szCs w:val="16"/>
               </w:rPr>
-              <w:t xml:space="preserve">$6.9 (30 days)</w:t>
+              <w:t xml:space="preserve">$6.90 (30 days)</w:t>
             </w:r>
           </w:p>
         </w:tc>
@@ -7985,7 +7985,7 @@
                 <w:sz w:val="16"/>
                 <w:szCs w:val="16"/>
               </w:rPr>
-              <w:t xml:space="preserve">$-1.17 (90 days)</w:t>
+              <w:t xml:space="preserve">−$1.17 (90 days)</w:t>
             </w:r>
           </w:p>
         </w:tc>
@@ -8452,7 +8452,7 @@
                 <w:sz w:val="16"/>
                 <w:szCs w:val="16"/>
               </w:rPr>
-              <w:t xml:space="preserve">$1.65 / $1.63 (1%)</w:t>
+              <w:t xml:space="preserve">$1.66 / $1.63 (2%)</w:t>
             </w:r>
           </w:p>
         </w:tc>
@@ -8803,7 +8803,7 @@
                 <w:sz w:val="16"/>
                 <w:szCs w:val="16"/>
               </w:rPr>
-              <w:t xml:space="preserve">$1.22 / $1.08 (13%)</w:t>
+              <w:t xml:space="preserve">$1.23 / $1.08 (14%)</w:t>
             </w:r>
           </w:p>
         </w:tc>
@@ -9271,7 +9271,7 @@
                 <w:sz w:val="16"/>
                 <w:szCs w:val="16"/>
               </w:rPr>
-              <w:t xml:space="preserve">$2.44 / $2.16 (13%)</w:t>
+              <w:t xml:space="preserve">$2.46 / $2.16 (14%)</w:t>
             </w:r>
           </w:p>
         </w:tc>
@@ -9505,7 +9505,7 @@
                 <w:sz w:val="16"/>
                 <w:szCs w:val="16"/>
               </w:rPr>
-              <w:t xml:space="preserve">$1.64 / $1.18 (39%)</w:t>
+              <w:t xml:space="preserve">$1.65 / $1.18 (40%)</w:t>
             </w:r>
           </w:p>
         </w:tc>
@@ -9549,7 +9549,7 @@
         <w:spacing w:after="120"/>
       </w:pPr>
       <w:r>
-        <w:t xml:space="preserve">Table 2 (every campaign, every placement: clicks, share, conversion, modifier) and the full Table 3 (51 rows, in loss-dollar order) are in the action plan. Table 4 — funded pushes: none (section 3).</w:t>
+        <w:t xml:space="preserve">Table 2 (every campaign, every placement: clicks, share, conversion, modifier) and the full Table 3 (52 rows, in loss-dollar order) are in the action plan. Table 4 — funded pushes: none (section 3).</w:t>
       </w:r>
     </w:p>
     <w:p>
@@ -15554,7 +15554,7 @@
                 <w:sz w:val="16"/>
                 <w:szCs w:val="16"/>
               </w:rPr>
-              <w:t xml:space="preserve">$25,685</w:t>
+              <w:t xml:space="preserve">$25,632</w:t>
             </w:r>
           </w:p>
         </w:tc>
@@ -15582,7 +15582,7 @@
                 <w:sz w:val="16"/>
                 <w:szCs w:val="16"/>
               </w:rPr>
-              <w:t xml:space="preserve">$4,132</w:t>
+              <w:t xml:space="preserve">$4,119</w:t>
             </w:r>
           </w:p>
         </w:tc>
@@ -15638,7 +15638,7 @@
                 <w:sz w:val="16"/>
                 <w:szCs w:val="16"/>
               </w:rPr>
-              <w:t xml:space="preserve">$2,241</w:t>
+              <w:t xml:space="preserve">$2,258</w:t>
             </w:r>
           </w:p>
         </w:tc>
@@ -15699,7 +15699,7 @@
                 <w:sz w:val="16"/>
                 <w:szCs w:val="16"/>
               </w:rPr>
-              <w:t xml:space="preserve">−$2,036</w:t>
+              <w:t xml:space="preserve">−$2,089</w:t>
             </w:r>
           </w:p>
         </w:tc>
@@ -15727,7 +15727,7 @@
                 <w:sz w:val="16"/>
                 <w:szCs w:val="16"/>
               </w:rPr>
-              <w:t xml:space="preserve">−$1,105</w:t>
+              <w:t xml:space="preserve">−$1,117</w:t>
             </w:r>
           </w:p>
         </w:tc>
@@ -15783,7 +15783,7 @@
                 <w:sz w:val="16"/>
                 <w:szCs w:val="16"/>
               </w:rPr>
-              <w:t xml:space="preserve">$580</w:t>
+              <w:t xml:space="preserve">$598</w:t>
             </w:r>
           </w:p>
         </w:tc>
@@ -15844,7 +15844,7 @@
                 <w:sz w:val="16"/>
                 <w:szCs w:val="16"/>
               </w:rPr>
-              <w:t xml:space="preserve">−$1,831</w:t>
+              <w:t xml:space="preserve">−$1,827</w:t>
             </w:r>
           </w:p>
         </w:tc>
@@ -15872,7 +15872,7 @@
                 <w:sz w:val="16"/>
                 <w:szCs w:val="16"/>
               </w:rPr>
-              <w:t xml:space="preserve">−$1,093</w:t>
+              <w:t xml:space="preserve">−$1,091</w:t>
             </w:r>
           </w:p>
         </w:tc>
@@ -15928,7 +15928,7 @@
                 <w:sz w:val="16"/>
                 <w:szCs w:val="16"/>
               </w:rPr>
-              <w:t xml:space="preserve">$603</w:t>
+              <w:t xml:space="preserve">$604</w:t>
             </w:r>
           </w:p>
         </w:tc>
@@ -15989,7 +15989,7 @@
                 <w:sz w:val="16"/>
                 <w:szCs w:val="16"/>
               </w:rPr>
-              <w:t xml:space="preserve">−$609</w:t>
+              <w:t xml:space="preserve">−$668</w:t>
             </w:r>
           </w:p>
         </w:tc>
@@ -16017,7 +16017,7 @@
                 <w:sz w:val="16"/>
                 <w:szCs w:val="16"/>
               </w:rPr>
-              <w:t xml:space="preserve">−$192</w:t>
+              <w:t xml:space="preserve">−$207</w:t>
             </w:r>
           </w:p>
         </w:tc>
@@ -16073,7 +16073,7 @@
                 <w:sz w:val="16"/>
                 <w:szCs w:val="16"/>
               </w:rPr>
-              <w:t xml:space="preserve">$2</w:t>
+              <w:t xml:space="preserve">$19</w:t>
             </w:r>
           </w:p>
         </w:tc>
@@ -16134,7 +16134,7 @@
                 <w:sz w:val="16"/>
                 <w:szCs w:val="16"/>
               </w:rPr>
-              <w:t xml:space="preserve">−$46</w:t>
+              <w:t xml:space="preserve">−$45</w:t>
             </w:r>
           </w:p>
         </w:tc>
@@ -16162,7 +16162,7 @@
                 <w:sz w:val="16"/>
                 <w:szCs w:val="16"/>
               </w:rPr>
-              <w:t xml:space="preserve">−$24</w:t>
+              <w:t xml:space="preserve">−$23</w:t>
             </w:r>
           </w:p>
         </w:tc>

</xml_diff>